<commit_message>
Update defect 1 and test case links
Co-Authored-By: Claude Opus 5.5 <noreply@anthropic.com>

Claude-Session: https://claude.ai/code/session_01WvaaHLHQtm29VcTEU5G3Gz
</commit_message>
<xml_diff>
--- a/Defects-Magnus.docx
+++ b/Defects-Magnus.docx
@@ -69,7 +69,7 @@
           <w:sz w:val="22"/>
           <w:szCs w:val="22"/>
         </w:rPr>
-        <w:t xml:space="preserve">“Selected skills are not saved when creating an employee”</w:t>
+        <w:t xml:space="preserve">“Website link on Home page opens a different site than its text shows”</w:t>
       </w:r>
     </w:p>
     <w:p>
@@ -96,7 +96,7 @@
           <w:sz w:val="22"/>
           <w:szCs w:val="22"/>
         </w:rPr>
-        <w:t xml:space="preserve">S2</w:t>
+        <w:t xml:space="preserve">S3</w:t>
       </w:r>
     </w:p>
     <w:p>
@@ -123,7 +123,7 @@
           <w:sz w:val="22"/>
           <w:szCs w:val="22"/>
         </w:rPr>
-        <w:t xml:space="preserve">P2</w:t>
+        <w:t xml:space="preserve">P3</w:t>
       </w:r>
     </w:p>
     <w:p>
@@ -177,7 +177,7 @@
           <w:sz w:val="22"/>
           <w:szCs w:val="22"/>
         </w:rPr>
-        <w:t xml:space="preserve">Employee - Create</w:t>
+        <w:t xml:space="preserve">Home</w:t>
       </w:r>
     </w:p>
     <w:p>
@@ -231,7 +231,7 @@
           <w:sz w:val="22"/>
           <w:szCs w:val="22"/>
         </w:rPr>
-        <w:t xml:space="preserve">TC_Magnus_15</w:t>
+        <w:t xml:space="preserve">TC_Magnus_12</w:t>
       </w:r>
     </w:p>
     <w:p>
@@ -258,7 +258,7 @@
           <w:sz w:val="22"/>
           <w:szCs w:val="22"/>
         </w:rPr>
-        <w:t xml:space="preserve">Selected skills are not saved when creating an employee</w:t>
+        <w:t xml:space="preserve">The link at the end of the Home page welcome message shows the text http://jalatechnologies.com, but clicking it opens https://jalaacademy.com/</w:t>
       </w:r>
     </w:p>
     <w:p>
@@ -290,7 +290,7 @@
           <w:sz w:val="22"/>
           <w:szCs w:val="22"/>
         </w:rPr>
-        <w:t xml:space="preserve">1. Login</w:t>
+        <w:t xml:space="preserve">1. Login with valid credentials</w:t>
       </w:r>
     </w:p>
     <w:p>
@@ -304,7 +304,7 @@
           <w:sz w:val="22"/>
           <w:szCs w:val="22"/>
         </w:rPr>
-        <w:t xml:space="preserve">2. Employee &gt; Create</w:t>
+        <w:t xml:space="preserve">2. Home page opens</w:t>
       </w:r>
     </w:p>
     <w:p>
@@ -318,7 +318,7 @@
           <w:sz w:val="22"/>
           <w:szCs w:val="22"/>
         </w:rPr>
-        <w:t xml:space="preserve">3. Fill all required fields</w:t>
+        <w:t xml:space="preserve">3. Read the welcome message on the Home page</w:t>
       </w:r>
     </w:p>
     <w:p>
@@ -332,7 +332,7 @@
           <w:sz w:val="22"/>
           <w:szCs w:val="22"/>
         </w:rPr>
-        <w:t xml:space="preserve">4. Tick 'AWS' and 'DevOps'</w:t>
+        <w:t xml:space="preserve">4. Find the link 'http://jalatechnologies.com' at the end of the message</w:t>
       </w:r>
     </w:p>
     <w:p>
@@ -346,7 +346,7 @@
           <w:sz w:val="22"/>
           <w:szCs w:val="22"/>
         </w:rPr>
-        <w:t xml:space="preserve">5. Click Save</w:t>
+        <w:t xml:space="preserve">5. Click the link</w:t>
       </w:r>
     </w:p>
     <w:p>
@@ -360,7 +360,7 @@
           <w:sz w:val="22"/>
           <w:szCs w:val="22"/>
         </w:rPr>
-        <w:t xml:space="preserve">6. Search the employee and click Edit</w:t>
+        <w:t xml:space="preserve">6. Check the address of the page that opens</w:t>
       </w:r>
     </w:p>
     <w:p>
@@ -392,7 +392,7 @@
           <w:sz w:val="22"/>
           <w:szCs w:val="22"/>
         </w:rPr>
-        <w:t xml:space="preserve">The ticked skills are saved and shown as ticked on Edit</w:t>
+        <w:t xml:space="preserve">http://jalatechnologies.com opens (the same site as the link text)</w:t>
       </w:r>
     </w:p>
     <w:p>
@@ -419,7 +419,7 @@
           <w:sz w:val="22"/>
           <w:szCs w:val="22"/>
         </w:rPr>
-        <w:t xml:space="preserve">Skills are not ticked on Edit. The save code selects checkboxes with class exactly 'chkSkill', but the checkboxes have class 'chkSkill m-r-sm', so no skills are sent</w:t>
+        <w:t xml:space="preserve">https://jalaacademy.com/ opens. The link text and the link address do not match</w:t>
       </w:r>
     </w:p>
     <w:p>
@@ -671,7 +671,7 @@
           <w:sz w:val="22"/>
           <w:szCs w:val="22"/>
         </w:rPr>
-        <w:t xml:space="preserve">TC_Magnus_38</w:t>
+        <w:t xml:space="preserve">TC_Magnus_39</w:t>
       </w:r>
     </w:p>
     <w:p>
@@ -1495,7 +1495,7 @@
           <w:sz w:val="22"/>
           <w:szCs w:val="22"/>
         </w:rPr>
-        <w:t xml:space="preserve">TC_Magnus_24</w:t>
+        <w:t xml:space="preserve">TC_Magnus_25</w:t>
       </w:r>
     </w:p>
     <w:p>
@@ -1893,7 +1893,7 @@
           <w:sz w:val="22"/>
           <w:szCs w:val="22"/>
         </w:rPr>
-        <w:t xml:space="preserve">TC_Magnus_20</w:t>
+        <w:t xml:space="preserve">TC_Magnus_21</w:t>
       </w:r>
     </w:p>
     <w:p>

</xml_diff>